<commit_message>
Add first view of g2
</commit_message>
<xml_diff>
--- a/docs/tempicoSoftwareUserManual/TausandTempicoSoftware Manual.docx
+++ b/docs/tempicoSoftwareUserManual/TausandTempicoSoftware Manual.docx
@@ -13,7 +13,6 @@
       </w:pPr>
       <w:bookmarkStart w:id="0" w:name="_Hlk535482051"/>
       <w:bookmarkEnd w:id="0"/>
-      <w:proofErr w:type="spellStart"/>
       <w:r>
         <w:rPr>
           <w:color w:val="000000" w:themeColor="text1"/>
@@ -21,7 +20,6 @@
         </w:rPr>
         <w:t>Tausand</w:t>
       </w:r>
-      <w:proofErr w:type="spellEnd"/>
     </w:p>
     <w:p>
       <w:pPr>
@@ -32,21 +30,12 @@
           <w:lang w:val="en-US"/>
         </w:rPr>
       </w:pPr>
-      <w:proofErr w:type="spellStart"/>
       <w:r>
         <w:rPr>
           <w:color w:val="000000" w:themeColor="text1"/>
           <w:lang w:val="en-US"/>
         </w:rPr>
-        <w:t>Tempico</w:t>
-      </w:r>
-      <w:proofErr w:type="spellEnd"/>
-      <w:r>
-        <w:rPr>
-          <w:color w:val="000000" w:themeColor="text1"/>
-          <w:lang w:val="en-US"/>
-        </w:rPr>
-        <w:t xml:space="preserve"> Software 1.</w:t>
+        <w:t>Tempico Software 1.</w:t>
       </w:r>
       <w:r>
         <w:rPr>
@@ -77,23 +66,7 @@
           <w:color w:val="000000" w:themeColor="text1"/>
           <w:lang w:val="en-US"/>
         </w:rPr>
-        <w:t xml:space="preserve">Software for </w:t>
-      </w:r>
-      <w:proofErr w:type="spellStart"/>
-      <w:r>
-        <w:rPr>
-          <w:color w:val="000000" w:themeColor="text1"/>
-          <w:lang w:val="en-US"/>
-        </w:rPr>
-        <w:t>Tempico</w:t>
-      </w:r>
-      <w:proofErr w:type="spellEnd"/>
-      <w:r>
-        <w:rPr>
-          <w:color w:val="000000" w:themeColor="text1"/>
-          <w:lang w:val="en-US"/>
-        </w:rPr>
-        <w:t xml:space="preserve"> TP1004</w:t>
+        <w:t>Software for Tempico TP1004</w:t>
       </w:r>
     </w:p>
     <w:p>
@@ -4345,47 +4318,7 @@
           <w:szCs w:val="20"/>
           <w:lang w:val="en-US"/>
         </w:rPr>
-        <w:t xml:space="preserve">The edge type indicates the type of transition that the time-to-digital converter (TDC) must use to start or stop a measurement. There are two main types: rise edge and falling edge. An event arriving at a TDC must be a short-duration pulse that exceeds the device's resolution. Therefore, if the transition goes from a low level (0) to a high level (1), we call it a rise edge. On the other hand, if we want to register an event when the signal transitions from a high level (1) to a low level (0), we call it a falling edge. The </w:t>
-      </w:r>
-      <w:proofErr w:type="spellStart"/>
-      <w:r>
-        <w:rPr>
-          <w:rFonts w:ascii="Arial" w:hAnsi="Arial" w:cs="Arial"/>
-          <w:sz w:val="20"/>
-          <w:szCs w:val="20"/>
-          <w:lang w:val="en-US"/>
-        </w:rPr>
-        <w:t>Tausand</w:t>
-      </w:r>
-      <w:proofErr w:type="spellEnd"/>
-      <w:r>
-        <w:rPr>
-          <w:rFonts w:ascii="Arial" w:hAnsi="Arial" w:cs="Arial"/>
-          <w:sz w:val="20"/>
-          <w:szCs w:val="20"/>
-          <w:lang w:val="en-US"/>
-        </w:rPr>
-        <w:t xml:space="preserve"> </w:t>
-      </w:r>
-      <w:proofErr w:type="spellStart"/>
-      <w:r>
-        <w:rPr>
-          <w:rFonts w:ascii="Arial" w:hAnsi="Arial" w:cs="Arial"/>
-          <w:sz w:val="20"/>
-          <w:szCs w:val="20"/>
-          <w:lang w:val="en-US"/>
-        </w:rPr>
-        <w:t>Tempico</w:t>
-      </w:r>
-      <w:proofErr w:type="spellEnd"/>
-      <w:r>
-        <w:rPr>
-          <w:rFonts w:ascii="Arial" w:hAnsi="Arial" w:cs="Arial"/>
-          <w:sz w:val="20"/>
-          <w:szCs w:val="20"/>
-          <w:lang w:val="en-US"/>
-        </w:rPr>
-        <w:t xml:space="preserve"> device allows for configuring the edge type for both the start signal and the stop signals. Below is a time diagram representation with a rise edge configuration for both the start signal (red) and the stop signal (blue).</w:t>
+        <w:t>The edge type indicates the type of transition that the time-to-digital converter (TDC) must use to start or stop a measurement. There are two main types: rise edge and falling edge. An event arriving at a TDC must be a short-duration pulse that exceeds the device's resolution. Therefore, if the transition goes from a low level (0) to a high level (1), we call it a rise edge. On the other hand, if we want to register an event when the signal transitions from a high level (1) to a low level (0), we call it a falling edge. The Tausand Tempico device allows for configuring the edge type for both the start signal and the stop signals. Below is a time diagram representation with a rise edge configuration for both the start signal (red) and the stop signal (blue).</w:t>
       </w:r>
     </w:p>
     <w:p>
@@ -4567,25 +4500,14 @@
           <w:lang w:val="en-US"/>
         </w:rPr>
       </w:pPr>
-      <w:proofErr w:type="spellStart"/>
-      <w:r>
-        <w:rPr>
-          <w:rFonts w:ascii="Arial" w:hAnsi="Arial" w:cs="Arial"/>
-          <w:sz w:val="20"/>
-          <w:szCs w:val="20"/>
-          <w:lang w:val="en-US"/>
-        </w:rPr>
-        <w:t>Tempico</w:t>
-      </w:r>
-      <w:proofErr w:type="spellEnd"/>
-      <w:r>
-        <w:rPr>
-          <w:rFonts w:ascii="Arial" w:hAnsi="Arial" w:cs="Arial"/>
-          <w:sz w:val="20"/>
-          <w:szCs w:val="20"/>
-          <w:lang w:val="en-US"/>
-        </w:rPr>
-        <w:t xml:space="preserve"> software is capable of capturing data in techniques that involve the emission and detection of pulses, such as in single photon counting. Several lifetime measurement methods can be applied depending on the type of analysis being performed.</w:t>
+      <w:r>
+        <w:rPr>
+          <w:rFonts w:ascii="Arial" w:hAnsi="Arial" w:cs="Arial"/>
+          <w:sz w:val="20"/>
+          <w:szCs w:val="20"/>
+          <w:lang w:val="en-US"/>
+        </w:rPr>
+        <w:t>Tempico software is capable of capturing data in techniques that involve the emission and detection of pulses, such as in single photon counting. Several lifetime measurement methods can be applied depending on the type of analysis being performed.</w:t>
       </w:r>
     </w:p>
     <w:p>
@@ -4668,65 +4590,14 @@
           <w:lang w:val="en-US"/>
         </w:rPr>
       </w:pPr>
-      <w:proofErr w:type="spellStart"/>
-      <w:r>
-        <w:rPr>
-          <w:rFonts w:ascii="Arial" w:hAnsi="Arial" w:cs="Arial"/>
-          <w:sz w:val="20"/>
-          <w:szCs w:val="20"/>
-          <w:lang w:val="en-US"/>
-        </w:rPr>
-        <w:t>Tempico</w:t>
-      </w:r>
-      <w:proofErr w:type="spellEnd"/>
-      <w:r>
-        <w:rPr>
-          <w:rFonts w:ascii="Arial" w:hAnsi="Arial" w:cs="Arial"/>
-          <w:sz w:val="20"/>
-          <w:szCs w:val="20"/>
-          <w:lang w:val="en-US"/>
-        </w:rPr>
-        <w:t xml:space="preserve"> Software is designed to facilitate the use of the </w:t>
-      </w:r>
-      <w:proofErr w:type="spellStart"/>
-      <w:r>
-        <w:rPr>
-          <w:rFonts w:ascii="Arial" w:hAnsi="Arial" w:cs="Arial"/>
-          <w:sz w:val="20"/>
-          <w:szCs w:val="20"/>
-          <w:lang w:val="en-US"/>
-        </w:rPr>
-        <w:t>Tausand</w:t>
-      </w:r>
-      <w:proofErr w:type="spellEnd"/>
-      <w:r>
-        <w:rPr>
-          <w:rFonts w:ascii="Arial" w:hAnsi="Arial" w:cs="Arial"/>
-          <w:sz w:val="20"/>
-          <w:szCs w:val="20"/>
-          <w:lang w:val="en-US"/>
-        </w:rPr>
-        <w:t xml:space="preserve"> </w:t>
-      </w:r>
-      <w:proofErr w:type="spellStart"/>
-      <w:r>
-        <w:rPr>
-          <w:rFonts w:ascii="Arial" w:hAnsi="Arial" w:cs="Arial"/>
-          <w:sz w:val="20"/>
-          <w:szCs w:val="20"/>
-          <w:lang w:val="en-US"/>
-        </w:rPr>
-        <w:t>Tempico</w:t>
-      </w:r>
-      <w:proofErr w:type="spellEnd"/>
-      <w:r>
-        <w:rPr>
-          <w:rFonts w:ascii="Arial" w:hAnsi="Arial" w:cs="Arial"/>
-          <w:sz w:val="20"/>
-          <w:szCs w:val="20"/>
-          <w:lang w:val="en-US"/>
-        </w:rPr>
-        <w:t xml:space="preserve"> TP1004 devices. It is a graphical interface that allows for time histogram measurements and </w:t>
+      <w:r>
+        <w:rPr>
+          <w:rFonts w:ascii="Arial" w:hAnsi="Arial" w:cs="Arial"/>
+          <w:sz w:val="20"/>
+          <w:szCs w:val="20"/>
+          <w:lang w:val="en-US"/>
+        </w:rPr>
+        <w:t xml:space="preserve">Tempico Software is designed to facilitate the use of the Tausand Tempico TP1004 devices. It is a graphical interface that allows for time histogram measurements and </w:t>
       </w:r>
       <w:r>
         <w:rPr>
@@ -4746,27 +4617,7 @@
           <w:szCs w:val="20"/>
           <w:lang w:val="en-US"/>
         </w:rPr>
-        <w:t xml:space="preserve"> measurements. From the software, it is possible to configure the device, as well as save the measurement data and generated graphs in various text and image formats, respectively. Additionally, </w:t>
-      </w:r>
-      <w:proofErr w:type="spellStart"/>
-      <w:r>
-        <w:rPr>
-          <w:rFonts w:ascii="Arial" w:hAnsi="Arial" w:cs="Arial"/>
-          <w:sz w:val="20"/>
-          <w:szCs w:val="20"/>
-          <w:lang w:val="en-US"/>
-        </w:rPr>
-        <w:t>Tempico</w:t>
-      </w:r>
-      <w:proofErr w:type="spellEnd"/>
-      <w:r>
-        <w:rPr>
-          <w:rFonts w:ascii="Arial" w:hAnsi="Arial" w:cs="Arial"/>
-          <w:sz w:val="20"/>
-          <w:szCs w:val="20"/>
-          <w:lang w:val="en-US"/>
-        </w:rPr>
-        <w:t xml:space="preserve"> Software provides extra functions, such as creating custom adjustments for certain graphs, and </w:t>
+        <w:t xml:space="preserve"> measurements. From the software, it is possible to configure the device, as well as save the measurement data and generated graphs in various text and image formats, respectively. Additionally, Tempico Software provides extra functions, such as creating custom adjustments for certain graphs, and </w:t>
       </w:r>
       <w:r>
         <w:rPr>
@@ -4822,45 +4673,14 @@
           <w:lang w:val="en-US"/>
         </w:rPr>
       </w:pPr>
-      <w:proofErr w:type="spellStart"/>
-      <w:r>
-        <w:rPr>
-          <w:rFonts w:ascii="Arial" w:hAnsi="Arial" w:cs="Arial"/>
-          <w:sz w:val="20"/>
-          <w:szCs w:val="20"/>
-          <w:lang w:val="en-US"/>
-        </w:rPr>
-        <w:t>Tempico</w:t>
-      </w:r>
-      <w:proofErr w:type="spellEnd"/>
-      <w:r>
-        <w:rPr>
-          <w:rFonts w:ascii="Arial" w:hAnsi="Arial" w:cs="Arial"/>
-          <w:sz w:val="20"/>
-          <w:szCs w:val="20"/>
-          <w:lang w:val="en-US"/>
-        </w:rPr>
-        <w:t xml:space="preserve"> software is designed to run on devices with low requirements, allowing any laboratory to use it. The minimum requirements for </w:t>
-      </w:r>
-      <w:proofErr w:type="spellStart"/>
-      <w:r>
-        <w:rPr>
-          <w:rFonts w:ascii="Arial" w:hAnsi="Arial" w:cs="Arial"/>
-          <w:sz w:val="20"/>
-          <w:szCs w:val="20"/>
-          <w:lang w:val="en-US"/>
-        </w:rPr>
-        <w:t>Tempico</w:t>
-      </w:r>
-      <w:proofErr w:type="spellEnd"/>
-      <w:r>
-        <w:rPr>
-          <w:rFonts w:ascii="Arial" w:hAnsi="Arial" w:cs="Arial"/>
-          <w:sz w:val="20"/>
-          <w:szCs w:val="20"/>
-          <w:lang w:val="en-US"/>
-        </w:rPr>
-        <w:t xml:space="preserve"> Software to function are as follows:</w:t>
+      <w:r>
+        <w:rPr>
+          <w:rFonts w:ascii="Arial" w:hAnsi="Arial" w:cs="Arial"/>
+          <w:sz w:val="20"/>
+          <w:szCs w:val="20"/>
+          <w:lang w:val="en-US"/>
+        </w:rPr>
+        <w:t>Tempico software is designed to run on devices with low requirements, allowing any laboratory to use it. The minimum requirements for Tempico Software to function are as follows:</w:t>
       </w:r>
     </w:p>
     <w:p>
@@ -5021,27 +4841,7 @@
           <w:szCs w:val="20"/>
           <w:lang w:val="en-US"/>
         </w:rPr>
-        <w:t xml:space="preserve">For measurements with large data sets or long durations (greater than 6 hours), the performance of </w:t>
-      </w:r>
-      <w:proofErr w:type="spellStart"/>
-      <w:r>
-        <w:rPr>
-          <w:rFonts w:ascii="Arial" w:hAnsi="Arial" w:cs="Arial"/>
-          <w:sz w:val="20"/>
-          <w:szCs w:val="20"/>
-          <w:lang w:val="en-US"/>
-        </w:rPr>
-        <w:t>Tempico</w:t>
-      </w:r>
-      <w:proofErr w:type="spellEnd"/>
-      <w:r>
-        <w:rPr>
-          <w:rFonts w:ascii="Arial" w:hAnsi="Arial" w:cs="Arial"/>
-          <w:sz w:val="20"/>
-          <w:szCs w:val="20"/>
-          <w:lang w:val="en-US"/>
-        </w:rPr>
-        <w:t xml:space="preserve"> Software may decrease. However, on higher-performance devices, this issue is mitigated.</w:t>
+        <w:t>For measurements with large data sets or long durations (greater than 6 hours), the performance of Tempico Software may decrease. However, on higher-performance devices, this issue is mitigated.</w:t>
       </w:r>
     </w:p>
     <w:p>
@@ -5112,27 +4912,7 @@
           <w:szCs w:val="20"/>
           <w:lang w:val="en-US"/>
         </w:rPr>
-        <w:t xml:space="preserve">The first step is to download the software from the </w:t>
-      </w:r>
-      <w:proofErr w:type="spellStart"/>
-      <w:r>
-        <w:rPr>
-          <w:rFonts w:ascii="Arial" w:hAnsi="Arial" w:cs="Arial"/>
-          <w:sz w:val="20"/>
-          <w:szCs w:val="20"/>
-          <w:lang w:val="en-US"/>
-        </w:rPr>
-        <w:t>Tausand</w:t>
-      </w:r>
-      <w:proofErr w:type="spellEnd"/>
-      <w:r>
-        <w:rPr>
-          <w:rFonts w:ascii="Arial" w:hAnsi="Arial" w:cs="Arial"/>
-          <w:sz w:val="20"/>
-          <w:szCs w:val="20"/>
-          <w:lang w:val="en-US"/>
-        </w:rPr>
-        <w:t xml:space="preserve"> website: </w:t>
+        <w:t xml:space="preserve">The first step is to download the software from the Tausand website: </w:t>
       </w:r>
       <w:hyperlink r:id="rId11" w:tgtFrame="_new" w:history="1">
         <w:r>
@@ -5480,35 +5260,7 @@
         <w:rPr>
           <w:lang w:val="en-US"/>
         </w:rPr>
-        <w:t xml:space="preserve">On Ubuntu, you only need to download the compressed (.zip) file from the official page. Once downloaded, extract its contents and run the </w:t>
-      </w:r>
-      <w:proofErr w:type="spellStart"/>
-      <w:r>
-        <w:rPr>
-          <w:lang w:val="en-US"/>
-        </w:rPr>
-        <w:t>AppImage</w:t>
-      </w:r>
-      <w:proofErr w:type="spellEnd"/>
-      <w:r>
-        <w:rPr>
-          <w:lang w:val="en-US"/>
-        </w:rPr>
-        <w:t xml:space="preserve"> file found inside. With this process, </w:t>
-      </w:r>
-      <w:proofErr w:type="spellStart"/>
-      <w:r>
-        <w:rPr>
-          <w:lang w:val="en-US"/>
-        </w:rPr>
-        <w:t>Tempico</w:t>
-      </w:r>
-      <w:proofErr w:type="spellEnd"/>
-      <w:r>
-        <w:rPr>
-          <w:lang w:val="en-US"/>
-        </w:rPr>
-        <w:t xml:space="preserve"> Software will be ready to use on your system.</w:t>
+        <w:t>On Ubuntu, you only need to download the compressed (.zip) file from the official page. Once downloaded, extract its contents and run the AppImage file found inside. With this process, Tempico Software will be ready to use on your system.</w:t>
       </w:r>
     </w:p>
     <w:p>
@@ -5638,27 +5390,7 @@
           <w:szCs w:val="20"/>
           <w:lang w:val="en-US"/>
         </w:rPr>
-        <w:t>On macOS, you only need to download the .zip file and extract its contents to your preferred folder. The file named “</w:t>
-      </w:r>
-      <w:proofErr w:type="spellStart"/>
-      <w:r>
-        <w:rPr>
-          <w:rFonts w:ascii="Arial" w:hAnsi="Arial" w:cs="Arial"/>
-          <w:sz w:val="20"/>
-          <w:szCs w:val="20"/>
-          <w:lang w:val="en-US"/>
-        </w:rPr>
-        <w:t>Tempico</w:t>
-      </w:r>
-      <w:proofErr w:type="spellEnd"/>
-      <w:r>
-        <w:rPr>
-          <w:rFonts w:ascii="Arial" w:hAnsi="Arial" w:cs="Arial"/>
-          <w:sz w:val="20"/>
-          <w:szCs w:val="20"/>
-          <w:lang w:val="en-US"/>
-        </w:rPr>
-        <w:t xml:space="preserve"> Software” is the one you need to run to launch the program.</w:t>
+        <w:t>On macOS, you only need to download the .zip file and extract its contents to your preferred folder. The file named “Tempico Software” is the one you need to run to launch the program.</w:t>
       </w:r>
     </w:p>
     <w:p>
@@ -5816,27 +5548,7 @@
           <w:szCs w:val="20"/>
           <w:lang w:val="en-US"/>
         </w:rPr>
-        <w:t xml:space="preserve">To ensure the proper functioning of </w:t>
-      </w:r>
-      <w:proofErr w:type="spellStart"/>
-      <w:r>
-        <w:rPr>
-          <w:rFonts w:ascii="Arial" w:hAnsi="Arial" w:cs="Arial"/>
-          <w:sz w:val="20"/>
-          <w:szCs w:val="20"/>
-          <w:lang w:val="en-US"/>
-        </w:rPr>
-        <w:t>Tempico</w:t>
-      </w:r>
-      <w:proofErr w:type="spellEnd"/>
-      <w:r>
-        <w:rPr>
-          <w:rFonts w:ascii="Arial" w:hAnsi="Arial" w:cs="Arial"/>
-          <w:sz w:val="20"/>
-          <w:szCs w:val="20"/>
-          <w:lang w:val="en-US"/>
-        </w:rPr>
-        <w:t xml:space="preserve"> Software, it is necessary to perform certain validations on the operating system.</w:t>
+        <w:t>To ensure the proper functioning of Tempico Software, it is necessary to perform certain validations on the operating system.</w:t>
       </w:r>
     </w:p>
     <w:p>
@@ -5881,67 +5593,7 @@
           <w:szCs w:val="20"/>
           <w:lang w:val="en-US"/>
         </w:rPr>
-        <w:t xml:space="preserve">You should ensure that the </w:t>
-      </w:r>
-      <w:proofErr w:type="spellStart"/>
-      <w:r>
-        <w:rPr>
-          <w:rFonts w:ascii="Arial" w:hAnsi="Arial" w:cs="Arial"/>
-          <w:sz w:val="20"/>
-          <w:szCs w:val="20"/>
-          <w:lang w:val="en-US"/>
-        </w:rPr>
-        <w:t>Tempico</w:t>
-      </w:r>
-      <w:proofErr w:type="spellEnd"/>
-      <w:r>
-        <w:rPr>
-          <w:rFonts w:ascii="Arial" w:hAnsi="Arial" w:cs="Arial"/>
-          <w:sz w:val="20"/>
-          <w:szCs w:val="20"/>
-          <w:lang w:val="en-US"/>
-        </w:rPr>
-        <w:t xml:space="preserve"> device is recognized by the COM ports. To do this, follow these steps: If, when connecting and turning on the device for the first time, a window appears indicating that the </w:t>
-      </w:r>
-      <w:proofErr w:type="spellStart"/>
-      <w:r>
-        <w:rPr>
-          <w:rFonts w:ascii="Arial" w:hAnsi="Arial" w:cs="Arial"/>
-          <w:sz w:val="20"/>
-          <w:szCs w:val="20"/>
-          <w:lang w:val="en-US"/>
-        </w:rPr>
-        <w:t>Tempico</w:t>
-      </w:r>
-      <w:proofErr w:type="spellEnd"/>
-      <w:r>
-        <w:rPr>
-          <w:rFonts w:ascii="Arial" w:hAnsi="Arial" w:cs="Arial"/>
-          <w:sz w:val="20"/>
-          <w:szCs w:val="20"/>
-          <w:lang w:val="en-US"/>
-        </w:rPr>
-        <w:t xml:space="preserve"> device is being configured, it means that Windows has recognized it correctly. If this does not happen, you can access the Device Manager without having the device connected and navigate it to the COM and LPT ports section. Then, connect and turn on the device. The port table should be updated; if it does not, close and reopen the window. When doing so, a new COM device should appear, indicating that the </w:t>
-      </w:r>
-      <w:proofErr w:type="spellStart"/>
-      <w:r>
-        <w:rPr>
-          <w:rFonts w:ascii="Arial" w:hAnsi="Arial" w:cs="Arial"/>
-          <w:sz w:val="20"/>
-          <w:szCs w:val="20"/>
-          <w:lang w:val="en-US"/>
-        </w:rPr>
-        <w:t>Tempico</w:t>
-      </w:r>
-      <w:proofErr w:type="spellEnd"/>
-      <w:r>
-        <w:rPr>
-          <w:rFonts w:ascii="Arial" w:hAnsi="Arial" w:cs="Arial"/>
-          <w:sz w:val="20"/>
-          <w:szCs w:val="20"/>
-          <w:lang w:val="en-US"/>
-        </w:rPr>
-        <w:t xml:space="preserve"> has been correctly detected.</w:t>
+        <w:t>You should ensure that the Tempico device is recognized by the COM ports. To do this, follow these steps: If, when connecting and turning on the device for the first time, a window appears indicating that the Tempico device is being configured, it means that Windows has recognized it correctly. If this does not happen, you can access the Device Manager without having the device connected and navigate it to the COM and LPT ports section. Then, connect and turn on the device. The port table should be updated; if it does not, close and reopen the window. When doing so, a new COM device should appear, indicating that the Tempico has been correctly detected.</w:t>
       </w:r>
     </w:p>
     <w:p>
@@ -5991,10 +5643,31 @@
           <w:szCs w:val="20"/>
           <w:lang w:val="en-US"/>
         </w:rPr>
-        <w:t>ls /dev/</w:t>
-      </w:r>
-      <w:proofErr w:type="spellStart"/>
-      <w:r>
+        <w:t>ls /dev/tty*</w:t>
+      </w:r>
+    </w:p>
+    <w:p>
+      <w:pPr>
+        <w:rPr>
+          <w:rFonts w:ascii="Arial" w:hAnsi="Arial" w:cs="Arial"/>
+          <w:sz w:val="20"/>
+          <w:szCs w:val="20"/>
+          <w:lang w:val="en-US"/>
+        </w:rPr>
+      </w:pPr>
+      <w:r>
+        <w:rPr>
+          <w:rFonts w:ascii="Arial" w:hAnsi="Arial" w:cs="Arial"/>
+          <w:sz w:val="20"/>
+          <w:szCs w:val="20"/>
+          <w:lang w:val="en-US"/>
+        </w:rPr>
+        <w:t>In this case, it is also necessary to verify that the ports are correctly detecting the device. To do this, we will use the command above, which lists the devices connected to the serial ports. First, we will run this command without the Tempico device connected and then run it again with the device connected. We will observe which new device has been detected</w:t>
+      </w:r>
+    </w:p>
+    <w:p>
+      <w:pPr>
+        <w:jc w:val="center"/>
         <w:rPr>
           <w:rFonts w:ascii="Arial" w:hAnsi="Arial" w:cs="Arial"/>
           <w:b/>
@@ -6003,9 +5676,7 @@
           <w:szCs w:val="20"/>
           <w:lang w:val="en-US"/>
         </w:rPr>
-        <w:t>tty</w:t>
-      </w:r>
-      <w:proofErr w:type="spellEnd"/>
+      </w:pPr>
       <w:r>
         <w:rPr>
           <w:rFonts w:ascii="Arial" w:hAnsi="Arial" w:cs="Arial"/>
@@ -6015,46 +5686,52 @@
           <w:szCs w:val="20"/>
           <w:lang w:val="en-US"/>
         </w:rPr>
-        <w:t>*</w:t>
-      </w:r>
-    </w:p>
-    <w:p>
-      <w:pPr>
-        <w:rPr>
-          <w:rFonts w:ascii="Arial" w:hAnsi="Arial" w:cs="Arial"/>
-          <w:sz w:val="20"/>
-          <w:szCs w:val="20"/>
-          <w:lang w:val="en-US"/>
-        </w:rPr>
-      </w:pPr>
-      <w:r>
-        <w:rPr>
-          <w:rFonts w:ascii="Arial" w:hAnsi="Arial" w:cs="Arial"/>
-          <w:sz w:val="20"/>
-          <w:szCs w:val="20"/>
-          <w:lang w:val="en-US"/>
-        </w:rPr>
-        <w:t xml:space="preserve">In this case, it is also necessary to verify that the ports are correctly detecting the device. To do this, we will use the command above, which lists the devices connected to the serial ports. First, we will run this command without the </w:t>
-      </w:r>
-      <w:proofErr w:type="spellStart"/>
-      <w:r>
-        <w:rPr>
-          <w:rFonts w:ascii="Arial" w:hAnsi="Arial" w:cs="Arial"/>
-          <w:sz w:val="20"/>
-          <w:szCs w:val="20"/>
-          <w:lang w:val="en-US"/>
-        </w:rPr>
-        <w:t>Tempico</w:t>
-      </w:r>
-      <w:proofErr w:type="spellEnd"/>
-      <w:r>
-        <w:rPr>
-          <w:rFonts w:ascii="Arial" w:hAnsi="Arial" w:cs="Arial"/>
-          <w:sz w:val="20"/>
-          <w:szCs w:val="20"/>
-          <w:lang w:val="en-US"/>
-        </w:rPr>
-        <w:t xml:space="preserve"> device connected and then run it again with the device connected. We will observe which new device has been detected</w:t>
+        <w:t>sudo adduser "username" dialout</w:t>
+      </w:r>
+    </w:p>
+    <w:p>
+      <w:pPr>
+        <w:rPr>
+          <w:rFonts w:ascii="Arial" w:hAnsi="Arial" w:cs="Arial"/>
+          <w:sz w:val="20"/>
+          <w:szCs w:val="20"/>
+          <w:lang w:val="en-US"/>
+        </w:rPr>
+      </w:pPr>
+      <w:r>
+        <w:rPr>
+          <w:rFonts w:ascii="Arial" w:hAnsi="Arial" w:cs="Arial"/>
+          <w:sz w:val="20"/>
+          <w:szCs w:val="20"/>
+          <w:lang w:val="en-US"/>
+        </w:rPr>
+        <w:t>If an error occurs indicating that the serial port could not be opened, it is possible that the user does not belong to the dialout group. To resolve this, we will execute the command above. This will allow us to access the system's serial ports.</w:t>
+      </w:r>
+    </w:p>
+    <w:p>
+      <w:pPr>
+        <w:rPr>
+          <w:rFonts w:ascii="Arial" w:hAnsi="Arial" w:cs="Arial"/>
+          <w:sz w:val="20"/>
+          <w:szCs w:val="20"/>
+        </w:rPr>
+      </w:pPr>
+      <w:r>
+        <w:rPr>
+          <w:rFonts w:ascii="Arial" w:hAnsi="Arial" w:cs="Arial"/>
+          <w:sz w:val="20"/>
+          <w:szCs w:val="20"/>
+        </w:rPr>
+        <w:lastRenderedPageBreak/>
+        <w:t>Si el comando no e</w:t>
+      </w:r>
+      <w:r>
+        <w:rPr>
+          <w:rFonts w:ascii="Arial" w:hAnsi="Arial" w:cs="Arial"/>
+          <w:sz w:val="20"/>
+          <w:szCs w:val="20"/>
+        </w:rPr>
+        <w:t>s suficiente y el software sigue lanzando errores debe verificarse cual es el puerto tty que se esta usando y debe ejecutarse lo siguiente:</w:t>
       </w:r>
     </w:p>
     <w:p>
@@ -6069,7 +5746,6 @@
           <w:lang w:val="en-US"/>
         </w:rPr>
       </w:pPr>
-      <w:proofErr w:type="spellStart"/>
       <w:r>
         <w:rPr>
           <w:rFonts w:ascii="Arial" w:hAnsi="Arial" w:cs="Arial"/>
@@ -6079,9 +5755,8 @@
           <w:szCs w:val="20"/>
           <w:lang w:val="en-US"/>
         </w:rPr>
-        <w:t>sudo</w:t>
-      </w:r>
-      <w:proofErr w:type="spellEnd"/>
+        <w:t xml:space="preserve">sudo </w:t>
+      </w:r>
       <w:r>
         <w:rPr>
           <w:rFonts w:ascii="Arial" w:hAnsi="Arial" w:cs="Arial"/>
@@ -6091,9 +5766,8 @@
           <w:szCs w:val="20"/>
           <w:lang w:val="en-US"/>
         </w:rPr>
-        <w:t xml:space="preserve"> </w:t>
-      </w:r>
-      <w:proofErr w:type="spellStart"/>
+        <w:t>ch mod 666 /dev/tty</w:t>
+      </w:r>
       <w:r>
         <w:rPr>
           <w:rFonts w:ascii="Arial" w:hAnsi="Arial" w:cs="Arial"/>
@@ -6103,9 +5777,8 @@
           <w:szCs w:val="20"/>
           <w:lang w:val="en-US"/>
         </w:rPr>
-        <w:t>adduser</w:t>
-      </w:r>
-      <w:proofErr w:type="spellEnd"/>
+        <w:t>"</w:t>
+      </w:r>
       <w:r>
         <w:rPr>
           <w:rFonts w:ascii="Arial" w:hAnsi="Arial" w:cs="Arial"/>
@@ -6115,236 +5788,8 @@
           <w:szCs w:val="20"/>
           <w:lang w:val="en-US"/>
         </w:rPr>
-        <w:t xml:space="preserve"> "username" </w:t>
-      </w:r>
-      <w:proofErr w:type="spellStart"/>
-      <w:r>
-        <w:rPr>
-          <w:rFonts w:ascii="Arial" w:hAnsi="Arial" w:cs="Arial"/>
-          <w:b/>
-          <w:bCs/>
-          <w:sz w:val="20"/>
-          <w:szCs w:val="20"/>
-          <w:lang w:val="en-US"/>
-        </w:rPr>
-        <w:t>dialout</w:t>
-      </w:r>
-      <w:proofErr w:type="spellEnd"/>
-    </w:p>
-    <w:p>
-      <w:pPr>
-        <w:rPr>
-          <w:rFonts w:ascii="Arial" w:hAnsi="Arial" w:cs="Arial"/>
-          <w:sz w:val="20"/>
-          <w:szCs w:val="20"/>
-          <w:lang w:val="en-US"/>
-        </w:rPr>
-      </w:pPr>
-      <w:r>
-        <w:rPr>
-          <w:rFonts w:ascii="Arial" w:hAnsi="Arial" w:cs="Arial"/>
-          <w:sz w:val="20"/>
-          <w:szCs w:val="20"/>
-          <w:lang w:val="en-US"/>
-        </w:rPr>
-        <w:t xml:space="preserve">If an error occurs indicating that the serial port could not be opened, it is possible that the user does not belong to the </w:t>
-      </w:r>
-      <w:proofErr w:type="spellStart"/>
-      <w:r>
-        <w:rPr>
-          <w:rFonts w:ascii="Arial" w:hAnsi="Arial" w:cs="Arial"/>
-          <w:sz w:val="20"/>
-          <w:szCs w:val="20"/>
-          <w:lang w:val="en-US"/>
-        </w:rPr>
-        <w:t>dialout</w:t>
-      </w:r>
-      <w:proofErr w:type="spellEnd"/>
-      <w:r>
-        <w:rPr>
-          <w:rFonts w:ascii="Arial" w:hAnsi="Arial" w:cs="Arial"/>
-          <w:sz w:val="20"/>
-          <w:szCs w:val="20"/>
-          <w:lang w:val="en-US"/>
-        </w:rPr>
-        <w:t xml:space="preserve"> group. To resolve this, we will execute the command above. This will allow us to access the system's serial ports.</w:t>
-      </w:r>
-    </w:p>
-    <w:p>
-      <w:pPr>
-        <w:rPr>
-          <w:rFonts w:ascii="Arial" w:hAnsi="Arial" w:cs="Arial"/>
-          <w:sz w:val="20"/>
-          <w:szCs w:val="20"/>
-        </w:rPr>
-      </w:pPr>
-      <w:r>
-        <w:rPr>
-          <w:rFonts w:ascii="Arial" w:hAnsi="Arial" w:cs="Arial"/>
-          <w:sz w:val="20"/>
-          <w:szCs w:val="20"/>
-        </w:rPr>
-        <w:lastRenderedPageBreak/>
-        <w:t>Si el comando no e</w:t>
-      </w:r>
-      <w:r>
-        <w:rPr>
-          <w:rFonts w:ascii="Arial" w:hAnsi="Arial" w:cs="Arial"/>
-          <w:sz w:val="20"/>
-          <w:szCs w:val="20"/>
-        </w:rPr>
-        <w:t xml:space="preserve">s suficiente y el software sigue lanzando errores debe verificarse </w:t>
-      </w:r>
-      <w:proofErr w:type="spellStart"/>
-      <w:r>
-        <w:rPr>
-          <w:rFonts w:ascii="Arial" w:hAnsi="Arial" w:cs="Arial"/>
-          <w:sz w:val="20"/>
-          <w:szCs w:val="20"/>
-        </w:rPr>
-        <w:t>cual</w:t>
-      </w:r>
-      <w:proofErr w:type="spellEnd"/>
-      <w:r>
-        <w:rPr>
-          <w:rFonts w:ascii="Arial" w:hAnsi="Arial" w:cs="Arial"/>
-          <w:sz w:val="20"/>
-          <w:szCs w:val="20"/>
-        </w:rPr>
-        <w:t xml:space="preserve"> es el puerto </w:t>
-      </w:r>
-      <w:proofErr w:type="spellStart"/>
-      <w:r>
-        <w:rPr>
-          <w:rFonts w:ascii="Arial" w:hAnsi="Arial" w:cs="Arial"/>
-          <w:sz w:val="20"/>
-          <w:szCs w:val="20"/>
-        </w:rPr>
-        <w:t>tty</w:t>
-      </w:r>
-      <w:proofErr w:type="spellEnd"/>
-      <w:r>
-        <w:rPr>
-          <w:rFonts w:ascii="Arial" w:hAnsi="Arial" w:cs="Arial"/>
-          <w:sz w:val="20"/>
-          <w:szCs w:val="20"/>
-        </w:rPr>
-        <w:t xml:space="preserve"> que se </w:t>
-      </w:r>
-      <w:proofErr w:type="spellStart"/>
-      <w:r>
-        <w:rPr>
-          <w:rFonts w:ascii="Arial" w:hAnsi="Arial" w:cs="Arial"/>
-          <w:sz w:val="20"/>
-          <w:szCs w:val="20"/>
-        </w:rPr>
-        <w:t>esta</w:t>
-      </w:r>
-      <w:proofErr w:type="spellEnd"/>
-      <w:r>
-        <w:rPr>
-          <w:rFonts w:ascii="Arial" w:hAnsi="Arial" w:cs="Arial"/>
-          <w:sz w:val="20"/>
-          <w:szCs w:val="20"/>
-        </w:rPr>
-        <w:t xml:space="preserve"> usando y debe ejecutarse lo siguiente:</w:t>
-      </w:r>
-    </w:p>
-    <w:p>
-      <w:pPr>
-        <w:jc w:val="center"/>
-        <w:rPr>
-          <w:rFonts w:ascii="Arial" w:hAnsi="Arial" w:cs="Arial"/>
-          <w:b/>
-          <w:bCs/>
-          <w:sz w:val="20"/>
-          <w:szCs w:val="20"/>
-          <w:lang w:val="en-US"/>
-        </w:rPr>
-      </w:pPr>
-      <w:proofErr w:type="spellStart"/>
-      <w:r>
-        <w:rPr>
-          <w:rFonts w:ascii="Arial" w:hAnsi="Arial" w:cs="Arial"/>
-          <w:b/>
-          <w:bCs/>
-          <w:sz w:val="20"/>
-          <w:szCs w:val="20"/>
-          <w:lang w:val="en-US"/>
-        </w:rPr>
-        <w:t>sudo</w:t>
-      </w:r>
-      <w:proofErr w:type="spellEnd"/>
-      <w:r>
-        <w:rPr>
-          <w:rFonts w:ascii="Arial" w:hAnsi="Arial" w:cs="Arial"/>
-          <w:b/>
-          <w:bCs/>
-          <w:sz w:val="20"/>
-          <w:szCs w:val="20"/>
-          <w:lang w:val="en-US"/>
-        </w:rPr>
-        <w:t xml:space="preserve"> </w:t>
-      </w:r>
-      <w:proofErr w:type="spellStart"/>
-      <w:r>
-        <w:rPr>
-          <w:rFonts w:ascii="Arial" w:hAnsi="Arial" w:cs="Arial"/>
-          <w:b/>
-          <w:bCs/>
-          <w:sz w:val="20"/>
-          <w:szCs w:val="20"/>
-          <w:lang w:val="en-US"/>
-        </w:rPr>
-        <w:t>ch</w:t>
-      </w:r>
-      <w:proofErr w:type="spellEnd"/>
-      <w:r>
-        <w:rPr>
-          <w:rFonts w:ascii="Arial" w:hAnsi="Arial" w:cs="Arial"/>
-          <w:b/>
-          <w:bCs/>
-          <w:sz w:val="20"/>
-          <w:szCs w:val="20"/>
-          <w:lang w:val="en-US"/>
-        </w:rPr>
-        <w:t xml:space="preserve"> mod 666 /dev/</w:t>
-      </w:r>
-      <w:proofErr w:type="spellStart"/>
-      <w:r>
-        <w:rPr>
-          <w:rFonts w:ascii="Arial" w:hAnsi="Arial" w:cs="Arial"/>
-          <w:b/>
-          <w:bCs/>
-          <w:sz w:val="20"/>
-          <w:szCs w:val="20"/>
-          <w:lang w:val="en-US"/>
-        </w:rPr>
-        <w:t>tty</w:t>
-      </w:r>
-      <w:r>
-        <w:rPr>
-          <w:rFonts w:ascii="Arial" w:hAnsi="Arial" w:cs="Arial"/>
-          <w:b/>
-          <w:bCs/>
-          <w:sz w:val="20"/>
-          <w:szCs w:val="20"/>
-          <w:lang w:val="en-US"/>
-        </w:rPr>
-        <w:t>"</w:t>
-      </w:r>
-      <w:r>
-        <w:rPr>
-          <w:rFonts w:ascii="Arial" w:hAnsi="Arial" w:cs="Arial"/>
-          <w:b/>
-          <w:bCs/>
-          <w:sz w:val="20"/>
-          <w:szCs w:val="20"/>
-          <w:lang w:val="en-US"/>
-        </w:rPr>
         <w:t>port</w:t>
       </w:r>
-      <w:proofErr w:type="spellEnd"/>
       <w:r>
         <w:rPr>
           <w:rFonts w:ascii="Arial" w:hAnsi="Arial" w:cs="Arial"/>
@@ -6433,86 +5878,26 @@
           <w:szCs w:val="20"/>
           <w:lang w:val="en-US"/>
         </w:rPr>
-        <w:t xml:space="preserve">To verify that the device is correctly connected to Mac, we must, with the </w:t>
-      </w:r>
-      <w:proofErr w:type="spellStart"/>
-      <w:r>
-        <w:rPr>
-          <w:rFonts w:ascii="Arial" w:hAnsi="Arial" w:cs="Arial"/>
-          <w:sz w:val="20"/>
-          <w:szCs w:val="20"/>
-          <w:lang w:val="en-US"/>
-        </w:rPr>
-        <w:t>Tempico</w:t>
-      </w:r>
-      <w:proofErr w:type="spellEnd"/>
-      <w:r>
-        <w:rPr>
-          <w:rFonts w:ascii="Arial" w:hAnsi="Arial" w:cs="Arial"/>
-          <w:sz w:val="20"/>
-          <w:szCs w:val="20"/>
-          <w:lang w:val="en-US"/>
-        </w:rPr>
-        <w:t xml:space="preserve"> turned off, execute the command above. This will provide a list of connected devices. Then, we run the command again with the </w:t>
-      </w:r>
-      <w:proofErr w:type="spellStart"/>
-      <w:r>
-        <w:rPr>
-          <w:rFonts w:ascii="Arial" w:hAnsi="Arial" w:cs="Arial"/>
-          <w:sz w:val="20"/>
-          <w:szCs w:val="20"/>
-          <w:lang w:val="en-US"/>
-        </w:rPr>
-        <w:t>Tempico</w:t>
-      </w:r>
-      <w:proofErr w:type="spellEnd"/>
-      <w:r>
-        <w:rPr>
-          <w:rFonts w:ascii="Arial" w:hAnsi="Arial" w:cs="Arial"/>
-          <w:sz w:val="20"/>
-          <w:szCs w:val="20"/>
-          <w:lang w:val="en-US"/>
-        </w:rPr>
-        <w:t xml:space="preserve"> turned on and observe which new port appears in the list.</w:t>
-      </w:r>
-    </w:p>
-    <w:p>
-      <w:pPr>
-        <w:rPr>
-          <w:rFonts w:ascii="Arial" w:hAnsi="Arial" w:cs="Arial"/>
-          <w:sz w:val="20"/>
-          <w:szCs w:val="20"/>
-          <w:lang w:val="en-US"/>
-        </w:rPr>
-      </w:pPr>
-      <w:r>
-        <w:rPr>
-          <w:rFonts w:ascii="Arial" w:hAnsi="Arial" w:cs="Arial"/>
-          <w:sz w:val="20"/>
-          <w:szCs w:val="20"/>
-          <w:lang w:val="en-US"/>
-        </w:rPr>
-        <w:t xml:space="preserve">If the device is not detected, the software will not recognize the connection, making it impossible to use the software. In this case, please contact </w:t>
-      </w:r>
-      <w:proofErr w:type="spellStart"/>
-      <w:r>
-        <w:rPr>
-          <w:rFonts w:ascii="Arial" w:hAnsi="Arial" w:cs="Arial"/>
-          <w:sz w:val="20"/>
-          <w:szCs w:val="20"/>
-          <w:lang w:val="en-US"/>
-        </w:rPr>
-        <w:t>Tausand</w:t>
-      </w:r>
-      <w:proofErr w:type="spellEnd"/>
-      <w:r>
-        <w:rPr>
-          <w:rFonts w:ascii="Arial" w:hAnsi="Arial" w:cs="Arial"/>
-          <w:sz w:val="20"/>
-          <w:szCs w:val="20"/>
-          <w:lang w:val="en-US"/>
-        </w:rPr>
-        <w:t xml:space="preserve"> support at: support@tausand.com.</w:t>
+        <w:t>To verify that the device is correctly connected to Mac, we must, with the Tempico turned off, execute the command above. This will provide a list of connected devices. Then, we run the command again with the Tempico turned on and observe which new port appears in the list.</w:t>
+      </w:r>
+    </w:p>
+    <w:p>
+      <w:pPr>
+        <w:rPr>
+          <w:rFonts w:ascii="Arial" w:hAnsi="Arial" w:cs="Arial"/>
+          <w:sz w:val="20"/>
+          <w:szCs w:val="20"/>
+          <w:lang w:val="en-US"/>
+        </w:rPr>
+      </w:pPr>
+      <w:r>
+        <w:rPr>
+          <w:rFonts w:ascii="Arial" w:hAnsi="Arial" w:cs="Arial"/>
+          <w:sz w:val="20"/>
+          <w:szCs w:val="20"/>
+          <w:lang w:val="en-US"/>
+        </w:rPr>
+        <w:t>If the device is not detected, the software will not recognize the connection, making it impossible to use the software. In this case, please contact Tausand support at: support@tausand.com.</w:t>
       </w:r>
     </w:p>
     <w:p>
@@ -6537,27 +5922,7 @@
           <w:szCs w:val="28"/>
           <w:lang w:val="en-US"/>
         </w:rPr>
-        <w:t xml:space="preserve">Open the software and select a </w:t>
-      </w:r>
-      <w:proofErr w:type="spellStart"/>
-      <w:r>
-        <w:rPr>
-          <w:rFonts w:ascii="Arial" w:hAnsi="Arial" w:cs="Arial"/>
-          <w:sz w:val="28"/>
-          <w:szCs w:val="28"/>
-          <w:lang w:val="en-US"/>
-        </w:rPr>
-        <w:t>Tempico</w:t>
-      </w:r>
-      <w:proofErr w:type="spellEnd"/>
-      <w:r>
-        <w:rPr>
-          <w:rFonts w:ascii="Arial" w:hAnsi="Arial" w:cs="Arial"/>
-          <w:sz w:val="28"/>
-          <w:szCs w:val="28"/>
-          <w:lang w:val="en-US"/>
-        </w:rPr>
-        <w:t xml:space="preserve"> device</w:t>
+        <w:t>Open the software and select a Tempico device</w:t>
       </w:r>
       <w:bookmarkEnd w:id="21"/>
     </w:p>
@@ -6657,19 +6022,19 @@
       <w:pPr>
         <w:jc w:val="center"/>
         <w:rPr>
-          <w:lang w:val="en-US"/>
-        </w:rPr>
-      </w:pPr>
-      <w:r>
-        <w:rPr>
-          <w:noProof/>
+          <w:u w:val="single"/>
+          <w:lang w:val="en-US"/>
+        </w:rPr>
+      </w:pPr>
+      <w:r>
+        <w:rPr>
           <w:lang w:val="en-US"/>
         </w:rPr>
         <w:drawing>
-          <wp:inline distT="0" distB="0" distL="0" distR="0" wp14:anchorId="4E5C52C0" wp14:editId="048F0FC6">
-            <wp:extent cx="4382112" cy="2114845"/>
-            <wp:effectExtent l="0" t="0" r="0" b="0"/>
-            <wp:docPr id="910353426" name="Imagen 1" descr="Interfaz de usuario gráfica, Aplicación&#10;&#10;Descripción generada automáticamente"/>
+          <wp:inline distT="0" distB="0" distL="0" distR="0" wp14:anchorId="60424A50" wp14:editId="61226AF6">
+            <wp:extent cx="4372585" cy="2162477"/>
+            <wp:effectExtent l="0" t="0" r="0" b="9525"/>
+            <wp:docPr id="400162780" name="Imagen 1" descr="Interfaz de usuario gráfica, Texto, Aplicación&#10;&#10;El contenido generado por IA puede ser incorrecto."/>
             <wp:cNvGraphicFramePr>
               <a:graphicFrameLocks xmlns:a="http://schemas.openxmlformats.org/drawingml/2006/main" noChangeAspect="1"/>
             </wp:cNvGraphicFramePr>
@@ -6677,7 +6042,7 @@
               <a:graphicData uri="http://schemas.openxmlformats.org/drawingml/2006/picture">
                 <pic:pic xmlns:pic="http://schemas.openxmlformats.org/drawingml/2006/picture">
                   <pic:nvPicPr>
-                    <pic:cNvPr id="910353426" name="Imagen 1" descr="Interfaz de usuario gráfica, Aplicación&#10;&#10;Descripción generada automáticamente"/>
+                    <pic:cNvPr id="400162780" name="Imagen 1" descr="Interfaz de usuario gráfica, Texto, Aplicación&#10;&#10;El contenido generado por IA puede ser incorrecto."/>
                     <pic:cNvPicPr/>
                   </pic:nvPicPr>
                   <pic:blipFill>
@@ -6689,7 +6054,7 @@
                   <pic:spPr>
                     <a:xfrm>
                       <a:off x="0" y="0"/>
-                      <a:ext cx="4382112" cy="2114845"/>
+                      <a:ext cx="4372585" cy="2162477"/>
                     </a:xfrm>
                     <a:prstGeom prst="rect">
                       <a:avLst/>
@@ -6718,27 +6083,7 @@
           <w:szCs w:val="20"/>
           <w:lang w:val="en-US"/>
         </w:rPr>
-        <w:t xml:space="preserve">If the software is opened and the device is not turned on, the window will not recognize the connection. Therefore, it is necessary to click the "Refresh" button to update the list of ports with a </w:t>
-      </w:r>
-      <w:proofErr w:type="spellStart"/>
-      <w:r>
-        <w:rPr>
-          <w:rFonts w:ascii="Arial" w:hAnsi="Arial" w:cs="Arial"/>
-          <w:sz w:val="20"/>
-          <w:szCs w:val="20"/>
-          <w:lang w:val="en-US"/>
-        </w:rPr>
-        <w:t>Tempico</w:t>
-      </w:r>
-      <w:proofErr w:type="spellEnd"/>
-      <w:r>
-        <w:rPr>
-          <w:rFonts w:ascii="Arial" w:hAnsi="Arial" w:cs="Arial"/>
-          <w:sz w:val="20"/>
-          <w:szCs w:val="20"/>
-          <w:lang w:val="en-US"/>
-        </w:rPr>
-        <w:t xml:space="preserve"> device.</w:t>
+        <w:t>If the software is opened and the device is not turned on, the window will not recognize the connection. Therefore, it is necessary to click the "Refresh" button to update the list of ports with a Tempico device.</w:t>
       </w:r>
     </w:p>
     <w:p>
@@ -6968,25 +6313,7 @@
           <w:szCs w:val="20"/>
           <w:lang w:val="en-US"/>
         </w:rPr>
-        <w:t xml:space="preserve">It is also possible to disconnect the device if we want to use another </w:t>
-      </w:r>
-      <w:proofErr w:type="spellStart"/>
-      <w:r>
-        <w:rPr>
-          <w:sz w:val="20"/>
-          <w:szCs w:val="20"/>
-          <w:lang w:val="en-US"/>
-        </w:rPr>
-        <w:t>Tempico</w:t>
-      </w:r>
-      <w:proofErr w:type="spellEnd"/>
-      <w:r>
-        <w:rPr>
-          <w:sz w:val="20"/>
-          <w:szCs w:val="20"/>
-          <w:lang w:val="en-US"/>
-        </w:rPr>
-        <w:t>. To do so, click the "Disconnect" button. If an error occurs while connecting to the device, the following error window will be displayed:</w:t>
+        <w:t>It is also possible to disconnect the device if we want to use another Tempico. To do so, click the "Disconnect" button. If an error occurs while connecting to the device, the following error window will be displayed:</w:t>
       </w:r>
     </w:p>
     <w:p>
@@ -7054,27 +6381,7 @@
           <w:szCs w:val="20"/>
           <w:lang w:val="en-US"/>
         </w:rPr>
-        <w:t xml:space="preserve">If this happens, it should be verified that no other program has established communication with the </w:t>
-      </w:r>
-      <w:proofErr w:type="spellStart"/>
-      <w:r>
-        <w:rPr>
-          <w:rFonts w:ascii="Arial" w:hAnsi="Arial" w:cs="Arial"/>
-          <w:sz w:val="20"/>
-          <w:szCs w:val="20"/>
-          <w:lang w:val="en-US"/>
-        </w:rPr>
-        <w:t>Tempico</w:t>
-      </w:r>
-      <w:proofErr w:type="spellEnd"/>
-      <w:r>
-        <w:rPr>
-          <w:rFonts w:ascii="Arial" w:hAnsi="Arial" w:cs="Arial"/>
-          <w:sz w:val="20"/>
-          <w:szCs w:val="20"/>
-          <w:lang w:val="en-US"/>
-        </w:rPr>
-        <w:t>, and ensure that the USB connection, whether the cable or the physical port, is in good condition. If no issues are found after verifying this, support should be contacted to find a solution to the problem.</w:t>
+        <w:t>If this happens, it should be verified that no other program has established communication with the Tempico, and ensure that the USB connection, whether the cable or the physical port, is in good condition. If no issues are found after verifying this, support should be contacted to find a solution to the problem.</w:t>
       </w:r>
     </w:p>
     <w:p>
@@ -7188,47 +6495,7 @@
           <w:szCs w:val="20"/>
           <w:lang w:val="en-US"/>
         </w:rPr>
-        <w:t xml:space="preserve">For each channel, you can modify the number of average cycles, the mode that defines the time range for measurements, the number of stops, the edge type and the stop mask. All these options provide a dropdown menu with the options allowed by the device (refer to the </w:t>
-      </w:r>
-      <w:proofErr w:type="spellStart"/>
-      <w:r>
-        <w:rPr>
-          <w:rFonts w:ascii="Arial" w:hAnsi="Arial" w:cs="Arial"/>
-          <w:sz w:val="20"/>
-          <w:szCs w:val="20"/>
-          <w:lang w:val="en-US"/>
-        </w:rPr>
-        <w:t>Tausand</w:t>
-      </w:r>
-      <w:proofErr w:type="spellEnd"/>
-      <w:r>
-        <w:rPr>
-          <w:rFonts w:ascii="Arial" w:hAnsi="Arial" w:cs="Arial"/>
-          <w:sz w:val="20"/>
-          <w:szCs w:val="20"/>
-          <w:lang w:val="en-US"/>
-        </w:rPr>
-        <w:t xml:space="preserve"> </w:t>
-      </w:r>
-      <w:proofErr w:type="spellStart"/>
-      <w:r>
-        <w:rPr>
-          <w:rFonts w:ascii="Arial" w:hAnsi="Arial" w:cs="Arial"/>
-          <w:sz w:val="20"/>
-          <w:szCs w:val="20"/>
-          <w:lang w:val="en-US"/>
-        </w:rPr>
-        <w:t>Tempico</w:t>
-      </w:r>
-      <w:proofErr w:type="spellEnd"/>
-      <w:r>
-        <w:rPr>
-          <w:rFonts w:ascii="Arial" w:hAnsi="Arial" w:cs="Arial"/>
-          <w:sz w:val="20"/>
-          <w:szCs w:val="20"/>
-          <w:lang w:val="en-US"/>
-        </w:rPr>
-        <w:t xml:space="preserve"> manual for more information), except for the stop mask.</w:t>
+        <w:t>For each channel, you can modify the number of average cycles, the mode that defines the time range for measurements, the number of stops, the edge type and the stop mask. All these options provide a dropdown menu with the options allowed by the device (refer to the Tausand Tempico manual for more information), except for the stop mask.</w:t>
       </w:r>
     </w:p>
     <w:p>
@@ -7958,27 +7225,7 @@
           <w:szCs w:val="20"/>
           <w:lang w:val="en-US"/>
         </w:rPr>
-        <w:t xml:space="preserve">"Start-stop" measurements are those that capture data from the basic functionality of the </w:t>
-      </w:r>
-      <w:proofErr w:type="spellStart"/>
-      <w:r>
-        <w:rPr>
-          <w:rFonts w:ascii="Arial" w:hAnsi="Arial" w:cs="Arial"/>
-          <w:sz w:val="20"/>
-          <w:szCs w:val="20"/>
-          <w:lang w:val="en-US"/>
-        </w:rPr>
-        <w:t>Tempico</w:t>
-      </w:r>
-      <w:proofErr w:type="spellEnd"/>
-      <w:r>
-        <w:rPr>
-          <w:rFonts w:ascii="Arial" w:hAnsi="Arial" w:cs="Arial"/>
-          <w:sz w:val="20"/>
-          <w:szCs w:val="20"/>
-          <w:lang w:val="en-US"/>
-        </w:rPr>
-        <w:t xml:space="preserve"> device. When a start pulse is received and, subsequently, a stop pulse arrives, the temporal difference between the two pulses is obtained. This point is plotted on a frequency histogram.</w:t>
+        <w:t>"Start-stop" measurements are those that capture data from the basic functionality of the Tempico device. When a start pulse is received and, subsequently, a stop pulse arrives, the temporal difference between the two pulses is obtained. This point is plotted on a frequency histogram.</w:t>
       </w:r>
     </w:p>
     <w:p>
@@ -8599,27 +7846,7 @@
           <w:szCs w:val="20"/>
           <w:lang w:val="en-US"/>
         </w:rPr>
-        <w:t xml:space="preserve">A possible solution to this issue is configuring the threshold voltage. It is recommended to set it to 1.6 V and check if the measurement is performed correctly. If the error persists, try different values for this parameter. If the issue continues and it is determined that it is not a fault in the setup or the input signal, </w:t>
-      </w:r>
-      <w:proofErr w:type="spellStart"/>
-      <w:r>
-        <w:rPr>
-          <w:rFonts w:ascii="Arial" w:hAnsi="Arial" w:cs="Arial"/>
-          <w:sz w:val="20"/>
-          <w:szCs w:val="20"/>
-          <w:lang w:val="en-US"/>
-        </w:rPr>
-        <w:t>Tausand</w:t>
-      </w:r>
-      <w:proofErr w:type="spellEnd"/>
-      <w:r>
-        <w:rPr>
-          <w:rFonts w:ascii="Arial" w:hAnsi="Arial" w:cs="Arial"/>
-          <w:sz w:val="20"/>
-          <w:szCs w:val="20"/>
-          <w:lang w:val="en-US"/>
-        </w:rPr>
-        <w:t xml:space="preserve"> support should be contacted.</w:t>
+        <w:t>A possible solution to this issue is configuring the threshold voltage. It is recommended to set it to 1.6 V and check if the measurement is performed correctly. If the error persists, try different values for this parameter. If the issue continues and it is determined that it is not a fault in the setup or the input signal, Tausand support should be contacted.</w:t>
       </w:r>
     </w:p>
     <w:p>
@@ -9188,27 +8415,7 @@
           <w:szCs w:val="20"/>
           <w:lang w:val="en-US"/>
         </w:rPr>
-        <w:t>Files are saved in all operating systems in the "</w:t>
-      </w:r>
-      <w:proofErr w:type="spellStart"/>
-      <w:r>
-        <w:rPr>
-          <w:rFonts w:ascii="Arial" w:hAnsi="Arial" w:cs="Arial"/>
-          <w:sz w:val="20"/>
-          <w:szCs w:val="20"/>
-          <w:lang w:val="en-US"/>
-        </w:rPr>
-        <w:t>TempicoSoftwareData</w:t>
-      </w:r>
-      <w:proofErr w:type="spellEnd"/>
-      <w:r>
-        <w:rPr>
-          <w:rFonts w:ascii="Arial" w:hAnsi="Arial" w:cs="Arial"/>
-          <w:sz w:val="20"/>
-          <w:szCs w:val="20"/>
-          <w:lang w:val="en-US"/>
-        </w:rPr>
-        <w:t>" folder within "Documents." By default, this folder is automatically created when the program is opened for the first time.</w:t>
+        <w:t>Files are saved in all operating systems in the "TempicoSoftwareData" folder within "Documents." By default, this folder is automatically created when the program is opened for the first time.</w:t>
       </w:r>
     </w:p>
     <w:p>
@@ -9632,27 +8839,7 @@
           <w:szCs w:val="20"/>
           <w:lang w:val="en-US"/>
         </w:rPr>
-        <w:t xml:space="preserve">To record lifetime measurements based on the time difference between input pulses and emitted excitation pulses, </w:t>
-      </w:r>
-      <w:proofErr w:type="spellStart"/>
-      <w:r>
-        <w:rPr>
-          <w:rFonts w:ascii="Arial" w:hAnsi="Arial" w:cs="Arial"/>
-          <w:sz w:val="20"/>
-          <w:szCs w:val="20"/>
-          <w:lang w:val="en-US"/>
-        </w:rPr>
-        <w:t>Tempico</w:t>
-      </w:r>
-      <w:proofErr w:type="spellEnd"/>
-      <w:r>
-        <w:rPr>
-          <w:rFonts w:ascii="Arial" w:hAnsi="Arial" w:cs="Arial"/>
-          <w:sz w:val="20"/>
-          <w:szCs w:val="20"/>
-          <w:lang w:val="en-US"/>
-        </w:rPr>
-        <w:t xml:space="preserve"> Software provides multiple tools to fulfill this functionality.</w:t>
+        <w:t>To record lifetime measurements based on the time difference between input pulses and emitted excitation pulses, Tempico Software provides multiple tools to fulfill this functionality.</w:t>
       </w:r>
     </w:p>
     <w:p>
@@ -9717,86 +8904,26 @@
           <w:lang w:val="en-US"/>
         </w:rPr>
         <w:lastRenderedPageBreak/>
-        <w:t xml:space="preserve">If a channel other than start is selected to initiate the measurement, a periodic electrical signal must be added to the start channel, as </w:t>
-      </w:r>
-      <w:proofErr w:type="spellStart"/>
-      <w:r>
-        <w:rPr>
-          <w:rFonts w:ascii="Arial" w:hAnsi="Arial" w:cs="Arial"/>
-          <w:sz w:val="20"/>
-          <w:szCs w:val="20"/>
-          <w:lang w:val="en-US"/>
-        </w:rPr>
-        <w:t>Tempico</w:t>
-      </w:r>
-      <w:proofErr w:type="spellEnd"/>
-      <w:r>
-        <w:rPr>
-          <w:rFonts w:ascii="Arial" w:hAnsi="Arial" w:cs="Arial"/>
-          <w:sz w:val="20"/>
-          <w:szCs w:val="20"/>
-          <w:lang w:val="en-US"/>
-        </w:rPr>
-        <w:t xml:space="preserve"> cannot measure signals on stop channels without a registered start event. This configuration risks losing data that arrives before the periodic signal is emitted. The pulse period must be short enough to reduce data loss. </w:t>
-      </w:r>
-      <w:proofErr w:type="spellStart"/>
-      <w:r>
-        <w:rPr>
-          <w:rFonts w:ascii="Arial" w:hAnsi="Arial" w:cs="Arial"/>
-          <w:sz w:val="20"/>
-          <w:szCs w:val="20"/>
-          <w:lang w:val="en-US"/>
-        </w:rPr>
-        <w:t>Tempico</w:t>
-      </w:r>
-      <w:proofErr w:type="spellEnd"/>
-      <w:r>
-        <w:rPr>
-          <w:rFonts w:ascii="Arial" w:hAnsi="Arial" w:cs="Arial"/>
-          <w:sz w:val="20"/>
-          <w:szCs w:val="20"/>
-          <w:lang w:val="en-US"/>
-        </w:rPr>
-        <w:t xml:space="preserve"> does not register stops occurring within less than 12 ns, making this setup useful for mitigating such effects. </w:t>
-      </w:r>
-    </w:p>
-    <w:p>
-      <w:pPr>
-        <w:rPr>
-          <w:rFonts w:ascii="Arial" w:hAnsi="Arial" w:cs="Arial"/>
-          <w:sz w:val="20"/>
-          <w:szCs w:val="20"/>
-          <w:lang w:val="en-US"/>
-        </w:rPr>
-      </w:pPr>
-      <w:r>
-        <w:rPr>
-          <w:rFonts w:ascii="Arial" w:hAnsi="Arial" w:cs="Arial"/>
-          <w:sz w:val="20"/>
-          <w:szCs w:val="20"/>
-          <w:lang w:val="en-US"/>
-        </w:rPr>
-        <w:t xml:space="preserve">After selecting the channel, the bin width must be chosen, representing the histogram's bar width. For example, with a bin width of 12 ns, if there are two measurements at 1 ns and 5 ns, both will contribute to the same histogram bar's frequency. The number of bins prevents histogram saturation and usually limits the time axis range. For instance, selecting a bin width of 480 </w:t>
-      </w:r>
-      <w:proofErr w:type="spellStart"/>
-      <w:r>
-        <w:rPr>
-          <w:rFonts w:ascii="Arial" w:hAnsi="Arial" w:cs="Arial"/>
-          <w:sz w:val="20"/>
-          <w:szCs w:val="20"/>
-          <w:lang w:val="en-US"/>
-        </w:rPr>
-        <w:t>ps</w:t>
-      </w:r>
-      <w:proofErr w:type="spellEnd"/>
-      <w:r>
-        <w:rPr>
-          <w:rFonts w:ascii="Arial" w:hAnsi="Arial" w:cs="Arial"/>
-          <w:sz w:val="20"/>
-          <w:szCs w:val="20"/>
-          <w:lang w:val="en-US"/>
-        </w:rPr>
-        <w:t xml:space="preserve"> and 50 bins results in a 24 ns range. Unlike start-stop histograms, lifetime measurements are designed with a limit, allowing the number of measurements to be specified. A measurement is counted when both start and stop channels record a value.</w:t>
+        <w:t xml:space="preserve">If a channel other than start is selected to initiate the measurement, a periodic electrical signal must be added to the start channel, as Tempico cannot measure signals on stop channels without a registered start event. This configuration risks losing data that arrives before the periodic signal is emitted. The pulse period must be short enough to reduce data loss. Tempico does not register stops occurring within less than 12 ns, making this setup useful for mitigating such effects. </w:t>
+      </w:r>
+    </w:p>
+    <w:p>
+      <w:pPr>
+        <w:rPr>
+          <w:rFonts w:ascii="Arial" w:hAnsi="Arial" w:cs="Arial"/>
+          <w:sz w:val="20"/>
+          <w:szCs w:val="20"/>
+          <w:lang w:val="en-US"/>
+        </w:rPr>
+      </w:pPr>
+      <w:r>
+        <w:rPr>
+          <w:rFonts w:ascii="Arial" w:hAnsi="Arial" w:cs="Arial"/>
+          <w:sz w:val="20"/>
+          <w:szCs w:val="20"/>
+          <w:lang w:val="en-US"/>
+        </w:rPr>
+        <w:t>After selecting the channel, the bin width must be chosen, representing the histogram's bar width. For example, with a bin width of 12 ns, if there are two measurements at 1 ns and 5 ns, both will contribute to the same histogram bar's frequency. The number of bins prevents histogram saturation and usually limits the time axis range. For instance, selecting a bin width of 480 ps and 50 bins results in a 24 ns range. Unlike start-stop histograms, lifetime measurements are designed with a limit, allowing the number of measurements to be specified. A measurement is counted when both start and stop channels record a value.</w:t>
       </w:r>
     </w:p>
     <w:p>
@@ -10207,61 +9334,7 @@
           <w:sz w:val="20"/>
           <w:szCs w:val="20"/>
         </w:rPr>
-        <w:t xml:space="preserve">Con el fin de obtener más información acerca de una medición, el usuario puede realizar un </w:t>
-      </w:r>
-      <w:proofErr w:type="spellStart"/>
-      <w:r>
-        <w:rPr>
-          <w:rFonts w:ascii="Arial" w:hAnsi="Arial" w:cs="Arial"/>
-          <w:sz w:val="20"/>
-          <w:szCs w:val="20"/>
-        </w:rPr>
-        <w:t>fit</w:t>
-      </w:r>
-      <w:proofErr w:type="spellEnd"/>
-      <w:r>
-        <w:rPr>
-          <w:rFonts w:ascii="Arial" w:hAnsi="Arial" w:cs="Arial"/>
-          <w:sz w:val="20"/>
-          <w:szCs w:val="20"/>
-        </w:rPr>
-        <w:t xml:space="preserve"> sobre la gráfica. Al realizar el </w:t>
-      </w:r>
-      <w:proofErr w:type="spellStart"/>
-      <w:r>
-        <w:rPr>
-          <w:rFonts w:ascii="Arial" w:hAnsi="Arial" w:cs="Arial"/>
-          <w:sz w:val="20"/>
-          <w:szCs w:val="20"/>
-        </w:rPr>
-        <w:t>fit</w:t>
-      </w:r>
-      <w:proofErr w:type="spellEnd"/>
-      <w:r>
-        <w:rPr>
-          <w:rFonts w:ascii="Arial" w:hAnsi="Arial" w:cs="Arial"/>
-          <w:sz w:val="20"/>
-          <w:szCs w:val="20"/>
-        </w:rPr>
-        <w:t xml:space="preserve"> obtiene en la tabla de la esquina superior derecha información más detallada acerca de los </w:t>
-      </w:r>
-      <w:proofErr w:type="spellStart"/>
-      <w:r>
-        <w:rPr>
-          <w:rFonts w:ascii="Arial" w:hAnsi="Arial" w:cs="Arial"/>
-          <w:sz w:val="20"/>
-          <w:szCs w:val="20"/>
-        </w:rPr>
-        <w:t>parametros</w:t>
-      </w:r>
-      <w:proofErr w:type="spellEnd"/>
-      <w:r>
-        <w:rPr>
-          <w:rFonts w:ascii="Arial" w:hAnsi="Arial" w:cs="Arial"/>
-          <w:sz w:val="20"/>
-          <w:szCs w:val="20"/>
-        </w:rPr>
-        <w:t xml:space="preserve"> de la ecuación a ajustar. Obtiene sus valores, su desviación estándar y sus respectivas unidades. </w:t>
+        <w:t xml:space="preserve">Con el fin de obtener más información acerca de una medición, el usuario puede realizar un fit sobre la gráfica. Al realizar el fit obtiene en la tabla de la esquina superior derecha información más detallada acerca de los parametros de la ecuación a ajustar. Obtiene sus valores, su desviación estándar y sus respectivas unidades. </w:t>
       </w:r>
     </w:p>
     <w:p/>
@@ -12024,27 +11097,7 @@
           <w:szCs w:val="20"/>
           <w:lang w:val="en-US"/>
         </w:rPr>
-        <w:t xml:space="preserve">), a window will appear to select the desired format for saving the data. The user can choose between txt, csv, or </w:t>
-      </w:r>
-      <w:proofErr w:type="spellStart"/>
-      <w:r>
-        <w:rPr>
-          <w:rFonts w:ascii="Arial" w:hAnsi="Arial" w:cs="Arial"/>
-          <w:sz w:val="20"/>
-          <w:szCs w:val="20"/>
-          <w:lang w:val="en-US"/>
-        </w:rPr>
-        <w:t>dat</w:t>
-      </w:r>
-      <w:proofErr w:type="spellEnd"/>
-      <w:r>
-        <w:rPr>
-          <w:rFonts w:ascii="Arial" w:hAnsi="Arial" w:cs="Arial"/>
-          <w:sz w:val="20"/>
-          <w:szCs w:val="20"/>
-          <w:lang w:val="en-US"/>
-        </w:rPr>
-        <w:t xml:space="preserve"> formats.</w:t>
+        <w:t>), a window will appear to select the desired format for saving the data. The user can choose between txt, csv, or dat formats.</w:t>
       </w:r>
     </w:p>
     <w:p>
@@ -12559,33 +11612,11 @@
           <w:lang w:val="en-US"/>
         </w:rPr>
       </w:pPr>
-      <w:proofErr w:type="spellStart"/>
-      <w:r>
-        <w:rPr>
-          <w:lang w:val="en-US"/>
-        </w:rPr>
-        <w:t>Tempico</w:t>
-      </w:r>
-      <w:proofErr w:type="spellEnd"/>
-      <w:r>
-        <w:rPr>
-          <w:lang w:val="en-US"/>
-        </w:rPr>
-        <w:t xml:space="preserve"> Software does not directly provide the exact count of pulses received on each channel, since the </w:t>
-      </w:r>
-      <w:proofErr w:type="spellStart"/>
-      <w:r>
-        <w:rPr>
-          <w:lang w:val="en-US"/>
-        </w:rPr>
-        <w:t>Tempico</w:t>
-      </w:r>
-      <w:proofErr w:type="spellEnd"/>
-      <w:r>
-        <w:rPr>
-          <w:lang w:val="en-US"/>
-        </w:rPr>
-        <w:t xml:space="preserve"> device accepts a maximum of five incoming pulses after a start </w:t>
+      <w:r>
+        <w:rPr>
+          <w:lang w:val="en-US"/>
+        </w:rPr>
+        <w:t xml:space="preserve">Tempico Software does not directly provide the exact count of pulses received on each channel, since the Tempico device accepts a maximum of five incoming pulses after a start </w:t>
       </w:r>
       <w:r>
         <w:rPr>
@@ -12631,21 +11662,7 @@
         <w:rPr>
           <w:lang w:val="en-US"/>
         </w:rPr>
-        <w:t xml:space="preserve">To estimate pulse counts in </w:t>
-      </w:r>
-      <w:proofErr w:type="spellStart"/>
-      <w:r>
-        <w:rPr>
-          <w:lang w:val="en-US"/>
-        </w:rPr>
-        <w:t>Tempico</w:t>
-      </w:r>
-      <w:proofErr w:type="spellEnd"/>
-      <w:r>
-        <w:rPr>
-          <w:lang w:val="en-US"/>
-        </w:rPr>
-        <w:t xml:space="preserve"> Software, it is essential that the measurement includes a periodic start pulse of very short duration, and that the source to be measured is connected to one of the available channels (A, B, C, or D). In this process, software settings such as average cycles, mode, number of stops, and stop mask have no effect, as the system automatically configures these parameters during the measurement. The software calculates the </w:t>
+        <w:t xml:space="preserve">To estimate pulse counts in Tempico Software, it is essential that the measurement includes a periodic start pulse of very short duration, and that the source to be measured is connected to one of the available channels (A, B, C, or D). In this process, software settings such as average cycles, mode, number of stops, and stop mask have no effect, as the system automatically configures these parameters during the measurement. The software calculates the </w:t>
       </w:r>
       <w:r>
         <w:rPr>
@@ -12740,21 +11757,7 @@
         <w:rPr>
           <w:lang w:val="en-US"/>
         </w:rPr>
-        <w:t xml:space="preserve">The </w:t>
-      </w:r>
-      <w:proofErr w:type="spellStart"/>
-      <w:r>
-        <w:rPr>
-          <w:lang w:val="en-US"/>
-        </w:rPr>
-        <w:t>Tempico</w:t>
-      </w:r>
-      <w:proofErr w:type="spellEnd"/>
-      <w:r>
-        <w:rPr>
-          <w:lang w:val="en-US"/>
-        </w:rPr>
-        <w:t xml:space="preserve"> device has a 4-millisecond window to receive a stop pulse after a start pulse is received. Additionally, it is essential that at least two pulses are detected after the start pulse during the measurement process, as otherwise it will not be possible to calculate the time differences between pulses. Therefore, the input signal must have a minimum frequency of 500 pulses per second </w:t>
+        <w:t xml:space="preserve">The Tempico device has a 4-millisecond window to receive a stop pulse after a start pulse is received. Additionally, it is essential that at least two pulses are detected after the start pulse during the measurement process, as otherwise it will not be possible to calculate the time differences between pulses. Therefore, the input signal must have a minimum frequency of 500 pulses per second </w:t>
       </w:r>
       <w:r>
         <w:rPr>
@@ -12896,21 +11899,7 @@
         <w:rPr>
           <w:lang w:val="en-US"/>
         </w:rPr>
-        <w:t xml:space="preserve">Once the user starts the measurement, the system automatically determines the number of stops required to begin count estimation. This step is critical, as configuring the </w:t>
-      </w:r>
-      <w:proofErr w:type="spellStart"/>
-      <w:r>
-        <w:rPr>
-          <w:lang w:val="en-US"/>
-        </w:rPr>
-        <w:t>Tempico</w:t>
-      </w:r>
-      <w:proofErr w:type="spellEnd"/>
-      <w:r>
-        <w:rPr>
-          <w:lang w:val="en-US"/>
-        </w:rPr>
-        <w:t xml:space="preserve"> device with several stops greater than the actual number of pulses received after a start pulse would result in no valid measurements being detected. To prevent this issue, the software analyzes the incoming signal behavior and automatically adjusts the appropriate number of stops before starting the counting process</w:t>
+        <w:t>Once the user starts the measurement, the system automatically determines the number of stops required to begin count estimation. This step is critical, as configuring the Tempico device with several stops greater than the actual number of pulses received after a start pulse would result in no valid measurements being detected. To prevent this issue, the software analyzes the incoming signal behavior and automatically adjusts the appropriate number of stops before starting the counting process</w:t>
       </w:r>
       <w:r>
         <w:rPr>
@@ -13534,14 +12523,7 @@
         <w:rPr>
           <w:lang w:val="en-US"/>
         </w:rPr>
-        <w:t xml:space="preserve">Time filters can be applied to the graphs using the Time Range dropdown menu. This allows you to adjust the time range on the X-axis to view the measurement history in detail. For example, if you select 50 seconds, all graphs will display the last 50 seconds of the recorded </w:t>
-      </w:r>
-      <w:proofErr w:type="spellStart"/>
-      <w:r>
-        <w:rPr>
-          <w:lang w:val="en-US"/>
-        </w:rPr>
-        <w:t>data.</w:t>
+        <w:t>Time filters can be applied to the graphs using the Time Range dropdown menu. This allows you to adjust the time range on the X-axis to view the measurement history in detail. For example, if you select 50 seconds, all graphs will display the last 50 seconds of the recorded data.</w:t>
       </w:r>
       <w:r>
         <w:rPr>
@@ -13549,7 +12531,6 @@
         </w:rPr>
         <w:t>S</w:t>
       </w:r>
-      <w:proofErr w:type="spellEnd"/>
     </w:p>
     <w:p>
       <w:pPr>
@@ -13660,14 +12641,7 @@
         <w:rPr>
           <w:lang w:val="en-US"/>
         </w:rPr>
-        <w:t xml:space="preserve">During the measurement, there is also a table section that displays the history of the estimated count values along with the corresponding hour, </w:t>
-      </w:r>
-      <w:proofErr w:type="spellStart"/>
-      <w:r>
-        <w:rPr>
-          <w:lang w:val="en-US"/>
-        </w:rPr>
-        <w:t>min</w:t>
+        <w:t>During the measurement, there is also a table section that displays the history of the estimated count values along with the corresponding hour, min</w:t>
       </w:r>
       <w:r>
         <w:rPr>
@@ -13679,14 +12653,7 @@
         <w:rPr>
           <w:lang w:val="en-US"/>
         </w:rPr>
-        <w:t>utes</w:t>
-      </w:r>
-      <w:proofErr w:type="spellEnd"/>
-      <w:r>
-        <w:rPr>
-          <w:lang w:val="en-US"/>
-        </w:rPr>
-        <w:t>, and seconds of registration. This section is located below the graphs displayed on the screen.</w:t>
+        <w:t>utes, and seconds of registration. This section is located below the graphs displayed on the screen.</w:t>
       </w:r>
     </w:p>
     <w:p>
@@ -14344,14 +13311,7 @@
         <w:rPr>
           <w:lang w:val="en-US"/>
         </w:rPr>
-        <w:t xml:space="preserve">Among the available formats for saving the data are .txt, .csv, and .dat. Upon clicking Accept, a window will appear confirming that the values have been successfully saved and displaying the path where the files are </w:t>
-      </w:r>
-      <w:proofErr w:type="spellStart"/>
-      <w:r>
-        <w:rPr>
-          <w:lang w:val="en-US"/>
-        </w:rPr>
-        <w:t>located.</w:t>
+        <w:t>Among the available formats for saving the data are .txt, .csv, and .dat. Upon clicking Accept, a window will appear confirming that the values have been successfully saved and displaying the path where the files are located.</w:t>
       </w:r>
       <w:r>
         <w:rPr>
@@ -14359,7 +13319,6 @@
         </w:rPr>
         <w:t>SS</w:t>
       </w:r>
-      <w:proofErr w:type="spellEnd"/>
     </w:p>
     <w:p>
       <w:pPr>
@@ -14761,27 +13720,7 @@
           <w:szCs w:val="20"/>
           <w:lang w:val="en-US"/>
         </w:rPr>
-        <w:t xml:space="preserve">To comprehensively capture every pulse arriving at the start channel, together with its corresponding stop pulses, while recording the precise timestamp of each event, </w:t>
-      </w:r>
-      <w:proofErr w:type="spellStart"/>
-      <w:r>
-        <w:rPr>
-          <w:rFonts w:ascii="Arial" w:hAnsi="Arial" w:cs="Arial"/>
-          <w:sz w:val="20"/>
-          <w:szCs w:val="20"/>
-          <w:lang w:val="en-US"/>
-        </w:rPr>
-        <w:t>Tempico</w:t>
-      </w:r>
-      <w:proofErr w:type="spellEnd"/>
-      <w:r>
-        <w:rPr>
-          <w:rFonts w:ascii="Arial" w:hAnsi="Arial" w:cs="Arial"/>
-          <w:sz w:val="20"/>
-          <w:szCs w:val="20"/>
-          <w:lang w:val="en-US"/>
-        </w:rPr>
-        <w:t xml:space="preserve"> Software provides a measurement mode optimized for fast and efficient data acquisition. This mode is specifically designed to handle large data volumes.</w:t>
+        <w:t>To comprehensively capture every pulse arriving at the start channel, together with its corresponding stop pulses, while recording the precise timestamp of each event, Tempico Software provides a measurement mode optimized for fast and efficient data acquisition. This mode is specifically designed to handle large data volumes.</w:t>
       </w:r>
     </w:p>
     <w:p>
@@ -15488,47 +14427,7 @@
           <w:szCs w:val="20"/>
           <w:lang w:val="en-US"/>
         </w:rPr>
-        <w:t xml:space="preserve">If an unexpected error occurs—such as an operating system failure, hardware malfunction, or sudden shutdown/restart—data can be recovered from the installation root directory of </w:t>
-      </w:r>
-      <w:proofErr w:type="spellStart"/>
-      <w:r>
-        <w:rPr>
-          <w:rFonts w:ascii="Arial" w:hAnsi="Arial" w:cs="Arial"/>
-          <w:sz w:val="20"/>
-          <w:szCs w:val="20"/>
-          <w:lang w:val="en-US"/>
-        </w:rPr>
-        <w:t>Tempico</w:t>
-      </w:r>
-      <w:proofErr w:type="spellEnd"/>
-      <w:r>
-        <w:rPr>
-          <w:rFonts w:ascii="Arial" w:hAnsi="Arial" w:cs="Arial"/>
-          <w:sz w:val="20"/>
-          <w:szCs w:val="20"/>
-          <w:lang w:val="en-US"/>
-        </w:rPr>
-        <w:t xml:space="preserve"> Software, inside the </w:t>
-      </w:r>
-      <w:proofErr w:type="spellStart"/>
-      <w:r>
-        <w:rPr>
-          <w:rFonts w:ascii="Arial" w:hAnsi="Arial" w:cs="Arial"/>
-          <w:sz w:val="20"/>
-          <w:szCs w:val="20"/>
-          <w:lang w:val="en-US"/>
-        </w:rPr>
-        <w:t>TempData</w:t>
-      </w:r>
-      <w:proofErr w:type="spellEnd"/>
-      <w:r>
-        <w:rPr>
-          <w:rFonts w:ascii="Arial" w:hAnsi="Arial" w:cs="Arial"/>
-          <w:sz w:val="20"/>
-          <w:szCs w:val="20"/>
-          <w:lang w:val="en-US"/>
-        </w:rPr>
-        <w:t xml:space="preserve"> folder. This directory contains the file AutoSaveData.txt, which stores all data recorded up to the last autosave. Although it is not recommended to open this file directly, it can be used as a recovery resource if necessary.</w:t>
+        <w:t>If an unexpected error occurs—such as an operating system failure, hardware malfunction, or sudden shutdown/restart—data can be recovered from the installation root directory of Tempico Software, inside the TempData folder. This directory contains the file AutoSaveData.txt, which stores all data recorded up to the last autosave. Although it is not recommended to open this file directly, it can be used as a recovery resource if necessary.</w:t>
       </w:r>
     </w:p>
     <w:p>
@@ -17646,25 +16545,14 @@
           <w:lang w:val="en-US"/>
         </w:rPr>
       </w:pPr>
-      <w:proofErr w:type="spellStart"/>
-      <w:r>
-        <w:rPr>
-          <w:rFonts w:ascii="Arial" w:hAnsi="Arial" w:cs="Arial"/>
-          <w:sz w:val="20"/>
-          <w:szCs w:val="20"/>
-          <w:lang w:val="en-US"/>
-        </w:rPr>
-        <w:t>Tempico</w:t>
-      </w:r>
-      <w:proofErr w:type="spellEnd"/>
-      <w:r>
-        <w:rPr>
-          <w:rFonts w:ascii="Arial" w:hAnsi="Arial" w:cs="Arial"/>
-          <w:sz w:val="20"/>
-          <w:szCs w:val="20"/>
-          <w:lang w:val="en-US"/>
-        </w:rPr>
-        <w:t xml:space="preserve"> Software is open source, allowing access to the software's source code and developer documentation through the GitHub platform. It also provides a guide to the code and the creation of respective installers for each operating system.</w:t>
+      <w:r>
+        <w:rPr>
+          <w:rFonts w:ascii="Arial" w:hAnsi="Arial" w:cs="Arial"/>
+          <w:sz w:val="20"/>
+          <w:szCs w:val="20"/>
+          <w:lang w:val="en-US"/>
+        </w:rPr>
+        <w:t>Tempico Software is open source, allowing access to the software's source code and developer documentation through the GitHub platform. It also provides a guide to the code and the creation of respective installers for each operating system.</w:t>
       </w:r>
     </w:p>
     <w:p>
@@ -17728,47 +16616,7 @@
           <w:szCs w:val="20"/>
           <w:lang w:val="en-US"/>
         </w:rPr>
-        <w:t xml:space="preserve">Your computer may automatically download and install from the Internet the required drivers once you connect your </w:t>
-      </w:r>
-      <w:proofErr w:type="spellStart"/>
-      <w:r>
-        <w:rPr>
-          <w:rFonts w:ascii="Arial" w:hAnsi="Arial" w:cs="Arial"/>
-          <w:sz w:val="20"/>
-          <w:szCs w:val="20"/>
-          <w:lang w:val="en-US"/>
-        </w:rPr>
-        <w:t>Tausand</w:t>
-      </w:r>
-      <w:proofErr w:type="spellEnd"/>
-      <w:r>
-        <w:rPr>
-          <w:rFonts w:ascii="Arial" w:hAnsi="Arial" w:cs="Arial"/>
-          <w:sz w:val="20"/>
-          <w:szCs w:val="20"/>
-          <w:lang w:val="en-US"/>
-        </w:rPr>
-        <w:t xml:space="preserve"> </w:t>
-      </w:r>
-      <w:proofErr w:type="spellStart"/>
-      <w:r>
-        <w:rPr>
-          <w:rFonts w:ascii="Arial" w:hAnsi="Arial" w:cs="Arial"/>
-          <w:sz w:val="20"/>
-          <w:szCs w:val="20"/>
-          <w:lang w:val="en-US"/>
-        </w:rPr>
-        <w:t>Tempico</w:t>
-      </w:r>
-      <w:proofErr w:type="spellEnd"/>
-      <w:r>
-        <w:rPr>
-          <w:rFonts w:ascii="Arial" w:hAnsi="Arial" w:cs="Arial"/>
-          <w:sz w:val="20"/>
-          <w:szCs w:val="20"/>
-          <w:lang w:val="en-US"/>
-        </w:rPr>
-        <w:t xml:space="preserve"> device to a USB port. If you require to install them manually, they are available at </w:t>
+        <w:t xml:space="preserve">Your computer may automatically download and install from the Internet the required drivers once you connect your Tausand Tempico device to a USB port. If you require to install them manually, they are available at </w:t>
       </w:r>
       <w:hyperlink r:id="rId136" w:history="1">
         <w:r>
@@ -18011,33 +16859,11 @@
             <w:color w:val="7F7F7F" w:themeColor="text1" w:themeTint="80"/>
           </w:rPr>
         </w:pPr>
-        <w:proofErr w:type="spellStart"/>
         <w:r>
           <w:rPr>
             <w:color w:val="7F7F7F" w:themeColor="text1" w:themeTint="80"/>
           </w:rPr>
-          <w:t>Tempico</w:t>
-        </w:r>
-        <w:proofErr w:type="spellEnd"/>
-        <w:r>
-          <w:rPr>
-            <w:color w:val="7F7F7F" w:themeColor="text1" w:themeTint="80"/>
-          </w:rPr>
-          <w:t xml:space="preserve"> software </w:t>
-        </w:r>
-        <w:proofErr w:type="spellStart"/>
-        <w:r>
-          <w:rPr>
-            <w:color w:val="7F7F7F" w:themeColor="text1" w:themeTint="80"/>
-          </w:rPr>
-          <w:t>user’s</w:t>
-        </w:r>
-        <w:proofErr w:type="spellEnd"/>
-        <w:r>
-          <w:rPr>
-            <w:color w:val="7F7F7F" w:themeColor="text1" w:themeTint="80"/>
-          </w:rPr>
-          <w:t xml:space="preserve"> manual</w:t>
+          <w:t>Tempico software user’s manual</w:t>
         </w:r>
       </w:p>
     </w:sdtContent>
@@ -19496,6 +18322,7 @@
     <w:rsid w:val="00141F35"/>
     <w:rsid w:val="0019347C"/>
     <w:rsid w:val="001C11CA"/>
+    <w:rsid w:val="003E3D81"/>
     <w:rsid w:val="004B6BE0"/>
     <w:rsid w:val="005655B3"/>
     <w:rsid w:val="00582394"/>
@@ -19505,7 +18332,6 @@
     <w:rsid w:val="00790198"/>
     <w:rsid w:val="00812AB5"/>
     <w:rsid w:val="00854A65"/>
-    <w:rsid w:val="008A0681"/>
     <w:rsid w:val="00925162"/>
     <w:rsid w:val="009D0744"/>
     <w:rsid w:val="009D54AA"/>

</xml_diff>

<commit_message>
Added read only and alert to user
</commit_message>
<xml_diff>
--- a/docs/tempicoSoftwareUserManual/TausandTempicoSoftware Manual.docx
+++ b/docs/tempicoSoftwareUserManual/TausandTempicoSoftware Manual.docx
@@ -276,7 +276,7 @@
         <w:rPr>
           <w:lang w:val="en-US"/>
         </w:rPr>
-        <w:t>August</w:t>
+        <w:t>October</w:t>
       </w:r>
       <w:r>
         <w:rPr>
@@ -292,16 +292,10 @@
       </w:r>
       <w:r>
         <w:rPr>
-          <w:lang w:val="en-US"/>
-        </w:rPr>
-        <w:t>8</w:t>
-      </w:r>
-      <w:r>
-        <w:rPr>
           <w:vertAlign w:val="superscript"/>
           <w:lang w:val="en-US"/>
         </w:rPr>
-        <w:t>th</w:t>
+        <w:t>st</w:t>
       </w:r>
       <w:r>
         <w:rPr>
@@ -6611,7 +6605,7 @@
           <w:lang w:val="en-US"/>
         </w:rPr>
         <w:drawing>
-          <wp:inline distT="0" distB="0" distL="0" distR="0" wp14:anchorId="525FDEF1" wp14:editId="25278293">
+          <wp:inline distT="0" distB="0" distL="0" distR="0" wp14:anchorId="525FDEF1" wp14:editId="22A033B5">
             <wp:extent cx="3013544" cy="1349241"/>
             <wp:effectExtent l="0" t="0" r="0" b="0"/>
             <wp:docPr id="358429826" name="Imagen 1" descr="Logotipo&#10;&#10;Descripción generada automáticamente"/>
@@ -10243,25 +10237,7 @@
           <w:sz w:val="20"/>
           <w:szCs w:val="20"/>
         </w:rPr>
-        <w:t xml:space="preserve"> obtiene en la tabla de la esquina superior derecha información más detallada acerca de los </w:t>
-      </w:r>
-      <w:proofErr w:type="spellStart"/>
-      <w:r>
-        <w:rPr>
-          <w:rFonts w:ascii="Arial" w:hAnsi="Arial" w:cs="Arial"/>
-          <w:sz w:val="20"/>
-          <w:szCs w:val="20"/>
-        </w:rPr>
-        <w:t>parametros</w:t>
-      </w:r>
-      <w:proofErr w:type="spellEnd"/>
-      <w:r>
-        <w:rPr>
-          <w:rFonts w:ascii="Arial" w:hAnsi="Arial" w:cs="Arial"/>
-          <w:sz w:val="20"/>
-          <w:szCs w:val="20"/>
-        </w:rPr>
-        <w:t xml:space="preserve"> de la ecuación a ajustar. Obtiene sus valores, su desviación estándar y sus respectivas unidades. </w:t>
+        <w:t xml:space="preserve"> obtiene en la tabla de la esquina superior derecha información más detallada acerca de los parametros de la ecuación a ajustar. Obtiene sus valores, su desviación estándar y sus respectivas unidades. </w:t>
       </w:r>
     </w:p>
     <w:p/>
@@ -16173,6 +16149,7 @@
         <w:rPr>
           <w:rFonts w:ascii="Arial" w:hAnsi="Arial" w:cs="Arial"/>
           <w:bCs/>
+          <w:noProof/>
           <w:sz w:val="20"/>
           <w:szCs w:val="20"/>
           <w:lang w:val="en-US"/>
@@ -18011,19 +17988,11 @@
             <w:color w:val="7F7F7F" w:themeColor="text1" w:themeTint="80"/>
           </w:rPr>
         </w:pPr>
-        <w:proofErr w:type="spellStart"/>
         <w:r>
           <w:rPr>
             <w:color w:val="7F7F7F" w:themeColor="text1" w:themeTint="80"/>
           </w:rPr>
-          <w:t>Tempico</w:t>
-        </w:r>
-        <w:proofErr w:type="spellEnd"/>
-        <w:r>
-          <w:rPr>
-            <w:color w:val="7F7F7F" w:themeColor="text1" w:themeTint="80"/>
-          </w:rPr>
-          <w:t xml:space="preserve"> software </w:t>
+          <w:t xml:space="preserve">Tempico software </w:t>
         </w:r>
         <w:proofErr w:type="spellStart"/>
         <w:r>
@@ -19496,6 +19465,7 @@
     <w:rsid w:val="00141F35"/>
     <w:rsid w:val="0019347C"/>
     <w:rsid w:val="001C11CA"/>
+    <w:rsid w:val="00353A65"/>
     <w:rsid w:val="004B6BE0"/>
     <w:rsid w:val="005655B3"/>
     <w:rsid w:val="00582394"/>
@@ -19512,6 +19482,7 @@
     <w:rsid w:val="009D632D"/>
     <w:rsid w:val="00A15EFF"/>
     <w:rsid w:val="00A522CA"/>
+    <w:rsid w:val="00AA3CBE"/>
     <w:rsid w:val="00B50367"/>
     <w:rsid w:val="00B956F5"/>
     <w:rsid w:val="00CE2C9F"/>

</xml_diff>